<commit_message>
Audit : résultats des tests ; fiches de phase et versions Word régénérées
Co-Authored-By: Claude Opus 5.5 <noreply@anthropic.com>
</commit_message>
<xml_diff>
--- a/docs/audits/AUDIT_2026-10-25_claude-phases-67-75.docx
+++ b/docs/audits/AUDIT_2026-10-25_claude-phases-67-75.docx
@@ -7925,9 +7925,573 @@
     </w:p>
     <w:p>
       <w:r>
-        <w:t xml:space="preserve">Résumé de la dernière exécution complète : _complété à la fin de l'audit (§ 9)._</w:t>
+        <w:t xml:space="preserve">Résumé de la dernière exécution complète (2026-10-25, après les corrections) :</w:t>
       </w:r>
     </w:p>
+    <w:tbl>
+      <w:tblPr>
+        <w:tblW w:type="dxa" w:w="9638"/>
+        <w:tblBorders>
+          <w:top w:val="single" w:color="auto" w:sz="4"/>
+          <w:left w:val="single" w:color="auto" w:sz="4"/>
+          <w:bottom w:val="single" w:color="auto" w:sz="4"/>
+          <w:right w:val="single" w:color="auto" w:sz="4"/>
+          <w:insideH w:val="single" w:color="auto" w:sz="4"/>
+          <w:insideV w:val="single" w:color="auto" w:sz="4"/>
+        </w:tblBorders>
+      </w:tblPr>
+      <w:tblGrid>
+        <w:gridCol w:w="2409"/>
+        <w:gridCol w:w="2409"/>
+        <w:gridCol w:w="2409"/>
+        <w:gridCol w:w="2411"/>
+      </w:tblGrid>
+      <w:tr>
+        <w:trPr>
+          <w:tblHeader/>
+        </w:trPr>
+        <w:tc>
+          <w:tcPr>
+            <w:tcW w:type="dxa" w:w="2409"/>
+            <w:tcBorders>
+              <w:top w:val="single" w:color="D9D3F7" w:sz="4"/>
+              <w:left w:val="single" w:color="D9D3F7" w:sz="4"/>
+              <w:bottom w:val="single" w:color="D9D3F7" w:sz="4"/>
+              <w:right w:val="single" w:color="D9D3F7" w:sz="4"/>
+            </w:tcBorders>
+            <w:shd w:fill="EFEAFE" w:color="auto" w:val="clear"/>
+            <w:tcMar>
+              <w:top w:type="dxa" w:w="50"/>
+              <w:left w:type="dxa" w:w="90"/>
+              <w:bottom w:type="dxa" w:w="50"/>
+              <w:right w:type="dxa" w:w="90"/>
+            </w:tcMar>
+          </w:tcPr>
+          <w:p>
+            <w:r>
+              <w:rPr>
+                <w:b/>
+                <w:bCs/>
+                <w:sz w:val="18"/>
+                <w:szCs w:val="18"/>
+              </w:rPr>
+              <w:t xml:space="preserve">Suite</w:t>
+            </w:r>
+          </w:p>
+        </w:tc>
+        <w:tc>
+          <w:tcPr>
+            <w:tcW w:type="dxa" w:w="2409"/>
+            <w:tcBorders>
+              <w:top w:val="single" w:color="D9D3F7" w:sz="4"/>
+              <w:left w:val="single" w:color="D9D3F7" w:sz="4"/>
+              <w:bottom w:val="single" w:color="D9D3F7" w:sz="4"/>
+              <w:right w:val="single" w:color="D9D3F7" w:sz="4"/>
+            </w:tcBorders>
+            <w:shd w:fill="EFEAFE" w:color="auto" w:val="clear"/>
+            <w:tcMar>
+              <w:top w:type="dxa" w:w="50"/>
+              <w:left w:type="dxa" w:w="90"/>
+              <w:bottom w:type="dxa" w:w="50"/>
+              <w:right w:type="dxa" w:w="90"/>
+            </w:tcMar>
+          </w:tcPr>
+          <w:p>
+            <w:r>
+              <w:rPr>
+                <w:b/>
+                <w:bCs/>
+                <w:sz w:val="18"/>
+                <w:szCs w:val="18"/>
+              </w:rPr>
+              <w:t xml:space="preserve">Fichiers</w:t>
+            </w:r>
+          </w:p>
+        </w:tc>
+        <w:tc>
+          <w:tcPr>
+            <w:tcW w:type="dxa" w:w="2409"/>
+            <w:tcBorders>
+              <w:top w:val="single" w:color="D9D3F7" w:sz="4"/>
+              <w:left w:val="single" w:color="D9D3F7" w:sz="4"/>
+              <w:bottom w:val="single" w:color="D9D3F7" w:sz="4"/>
+              <w:right w:val="single" w:color="D9D3F7" w:sz="4"/>
+            </w:tcBorders>
+            <w:shd w:fill="EFEAFE" w:color="auto" w:val="clear"/>
+            <w:tcMar>
+              <w:top w:type="dxa" w:w="50"/>
+              <w:left w:type="dxa" w:w="90"/>
+              <w:bottom w:type="dxa" w:w="50"/>
+              <w:right w:type="dxa" w:w="90"/>
+            </w:tcMar>
+          </w:tcPr>
+          <w:p>
+            <w:r>
+              <w:rPr>
+                <w:b/>
+                <w:bCs/>
+                <w:sz w:val="18"/>
+                <w:szCs w:val="18"/>
+              </w:rPr>
+              <w:t xml:space="preserve">Tests</w:t>
+            </w:r>
+          </w:p>
+        </w:tc>
+        <w:tc>
+          <w:tcPr>
+            <w:tcW w:type="dxa" w:w="2411"/>
+            <w:tcBorders>
+              <w:top w:val="single" w:color="D9D3F7" w:sz="4"/>
+              <w:left w:val="single" w:color="D9D3F7" w:sz="4"/>
+              <w:bottom w:val="single" w:color="D9D3F7" w:sz="4"/>
+              <w:right w:val="single" w:color="D9D3F7" w:sz="4"/>
+            </w:tcBorders>
+            <w:shd w:fill="EFEAFE" w:color="auto" w:val="clear"/>
+            <w:tcMar>
+              <w:top w:type="dxa" w:w="50"/>
+              <w:left w:type="dxa" w:w="90"/>
+              <w:bottom w:type="dxa" w:w="50"/>
+              <w:right w:type="dxa" w:w="90"/>
+            </w:tcMar>
+          </w:tcPr>
+          <w:p>
+            <w:r>
+              <w:rPr>
+                <w:b/>
+                <w:bCs/>
+                <w:sz w:val="18"/>
+                <w:szCs w:val="18"/>
+              </w:rPr>
+              <w:t xml:space="preserve">Résultat</w:t>
+            </w:r>
+          </w:p>
+        </w:tc>
+      </w:tr>
+      <w:tr>
+        <w:trPr>
+          <w:tblHeader w:val="false"/>
+        </w:trPr>
+        <w:tc>
+          <w:tcPr>
+            <w:tcW w:type="dxa" w:w="2409"/>
+            <w:tcBorders>
+              <w:top w:val="single" w:color="D9D3F7" w:sz="4"/>
+              <w:left w:val="single" w:color="D9D3F7" w:sz="4"/>
+              <w:bottom w:val="single" w:color="D9D3F7" w:sz="4"/>
+              <w:right w:val="single" w:color="D9D3F7" w:sz="4"/>
+            </w:tcBorders>
+            <w:tcMar>
+              <w:top w:type="dxa" w:w="50"/>
+              <w:left w:type="dxa" w:w="90"/>
+              <w:bottom w:type="dxa" w:w="50"/>
+              <w:right w:type="dxa" w:w="90"/>
+            </w:tcMar>
+          </w:tcPr>
+          <w:p>
+            <w:r>
+              <w:rPr>
+                <w:sz w:val="18"/>
+                <w:szCs w:val="18"/>
+              </w:rPr>
+              <w:t xml:space="preserve">Moteur (</w:t>
+            </w:r>
+            <w:r>
+              <w:rPr>
+                <w:rFonts w:ascii="Consolas" w:cs="Consolas" w:eastAsia="Consolas" w:hAnsi="Consolas"/>
+                <w:color w:val="3B2F8F"/>
+                <w:sz w:val="18"/>
+                <w:szCs w:val="18"/>
+              </w:rPr>
+              <w:t xml:space="preserve">packages/domain</w:t>
+            </w:r>
+            <w:r>
+              <w:rPr>
+                <w:sz w:val="18"/>
+                <w:szCs w:val="18"/>
+              </w:rPr>
+              <w:t xml:space="preserve">)</w:t>
+            </w:r>
+          </w:p>
+        </w:tc>
+        <w:tc>
+          <w:tcPr>
+            <w:tcW w:type="dxa" w:w="2409"/>
+            <w:tcBorders>
+              <w:top w:val="single" w:color="D9D3F7" w:sz="4"/>
+              <w:left w:val="single" w:color="D9D3F7" w:sz="4"/>
+              <w:bottom w:val="single" w:color="D9D3F7" w:sz="4"/>
+              <w:right w:val="single" w:color="D9D3F7" w:sz="4"/>
+            </w:tcBorders>
+            <w:tcMar>
+              <w:top w:type="dxa" w:w="50"/>
+              <w:left w:type="dxa" w:w="90"/>
+              <w:bottom w:type="dxa" w:w="50"/>
+              <w:right w:type="dxa" w:w="90"/>
+            </w:tcMar>
+          </w:tcPr>
+          <w:p>
+            <w:r>
+              <w:rPr>
+                <w:sz w:val="18"/>
+                <w:szCs w:val="18"/>
+              </w:rPr>
+              <w:t xml:space="preserve">42</w:t>
+            </w:r>
+          </w:p>
+        </w:tc>
+        <w:tc>
+          <w:tcPr>
+            <w:tcW w:type="dxa" w:w="2409"/>
+            <w:tcBorders>
+              <w:top w:val="single" w:color="D9D3F7" w:sz="4"/>
+              <w:left w:val="single" w:color="D9D3F7" w:sz="4"/>
+              <w:bottom w:val="single" w:color="D9D3F7" w:sz="4"/>
+              <w:right w:val="single" w:color="D9D3F7" w:sz="4"/>
+            </w:tcBorders>
+            <w:tcMar>
+              <w:top w:type="dxa" w:w="50"/>
+              <w:left w:type="dxa" w:w="90"/>
+              <w:bottom w:type="dxa" w:w="50"/>
+              <w:right w:type="dxa" w:w="90"/>
+            </w:tcMar>
+          </w:tcPr>
+          <w:p>
+            <w:r>
+              <w:rPr>
+                <w:sz w:val="18"/>
+                <w:szCs w:val="18"/>
+              </w:rPr>
+              <w:t xml:space="preserve">285</w:t>
+            </w:r>
+          </w:p>
+        </w:tc>
+        <w:tc>
+          <w:tcPr>
+            <w:tcW w:type="dxa" w:w="2411"/>
+            <w:tcBorders>
+              <w:top w:val="single" w:color="D9D3F7" w:sz="4"/>
+              <w:left w:val="single" w:color="D9D3F7" w:sz="4"/>
+              <w:bottom w:val="single" w:color="D9D3F7" w:sz="4"/>
+              <w:right w:val="single" w:color="D9D3F7" w:sz="4"/>
+            </w:tcBorders>
+            <w:tcMar>
+              <w:top w:type="dxa" w:w="50"/>
+              <w:left w:type="dxa" w:w="90"/>
+              <w:bottom w:type="dxa" w:w="50"/>
+              <w:right w:type="dxa" w:w="90"/>
+            </w:tcMar>
+          </w:tcPr>
+          <w:p>
+            <w:r>
+              <w:rPr>
+                <w:sz w:val="18"/>
+                <w:szCs w:val="18"/>
+              </w:rPr>
+              <w:t xml:space="preserve">tous verts, d'un seul bloc</w:t>
+            </w:r>
+          </w:p>
+        </w:tc>
+      </w:tr>
+      <w:tr>
+        <w:trPr>
+          <w:tblHeader w:val="false"/>
+        </w:trPr>
+        <w:tc>
+          <w:tcPr>
+            <w:tcW w:type="dxa" w:w="2409"/>
+            <w:tcBorders>
+              <w:top w:val="single" w:color="D9D3F7" w:sz="4"/>
+              <w:left w:val="single" w:color="D9D3F7" w:sz="4"/>
+              <w:bottom w:val="single" w:color="D9D3F7" w:sz="4"/>
+              <w:right w:val="single" w:color="D9D3F7" w:sz="4"/>
+            </w:tcBorders>
+            <w:tcMar>
+              <w:top w:type="dxa" w:w="50"/>
+              <w:left w:type="dxa" w:w="90"/>
+              <w:bottom w:type="dxa" w:w="50"/>
+              <w:right w:type="dxa" w:w="90"/>
+            </w:tcMar>
+          </w:tcPr>
+          <w:p>
+            <w:r>
+              <w:rPr>
+                <w:sz w:val="18"/>
+                <w:szCs w:val="18"/>
+              </w:rPr>
+              <w:t xml:space="preserve">Serveur (</w:t>
+            </w:r>
+            <w:r>
+              <w:rPr>
+                <w:rFonts w:ascii="Consolas" w:cs="Consolas" w:eastAsia="Consolas" w:hAnsi="Consolas"/>
+                <w:color w:val="3B2F8F"/>
+                <w:sz w:val="18"/>
+                <w:szCs w:val="18"/>
+              </w:rPr>
+              <w:t xml:space="preserve">apps/api</w:t>
+            </w:r>
+            <w:r>
+              <w:rPr>
+                <w:sz w:val="18"/>
+                <w:szCs w:val="18"/>
+              </w:rPr>
+              <w:t xml:space="preserve">, contre PostgreSQL)</w:t>
+            </w:r>
+          </w:p>
+        </w:tc>
+        <w:tc>
+          <w:tcPr>
+            <w:tcW w:type="dxa" w:w="2409"/>
+            <w:tcBorders>
+              <w:top w:val="single" w:color="D9D3F7" w:sz="4"/>
+              <w:left w:val="single" w:color="D9D3F7" w:sz="4"/>
+              <w:bottom w:val="single" w:color="D9D3F7" w:sz="4"/>
+              <w:right w:val="single" w:color="D9D3F7" w:sz="4"/>
+            </w:tcBorders>
+            <w:tcMar>
+              <w:top w:type="dxa" w:w="50"/>
+              <w:left w:type="dxa" w:w="90"/>
+              <w:bottom w:type="dxa" w:w="50"/>
+              <w:right w:type="dxa" w:w="90"/>
+            </w:tcMar>
+          </w:tcPr>
+          <w:p>
+            <w:r>
+              <w:rPr>
+                <w:sz w:val="18"/>
+                <w:szCs w:val="18"/>
+              </w:rPr>
+              <w:t xml:space="preserve">51</w:t>
+            </w:r>
+          </w:p>
+        </w:tc>
+        <w:tc>
+          <w:tcPr>
+            <w:tcW w:type="dxa" w:w="2409"/>
+            <w:tcBorders>
+              <w:top w:val="single" w:color="D9D3F7" w:sz="4"/>
+              <w:left w:val="single" w:color="D9D3F7" w:sz="4"/>
+              <w:bottom w:val="single" w:color="D9D3F7" w:sz="4"/>
+              <w:right w:val="single" w:color="D9D3F7" w:sz="4"/>
+            </w:tcBorders>
+            <w:tcMar>
+              <w:top w:type="dxa" w:w="50"/>
+              <w:left w:type="dxa" w:w="90"/>
+              <w:bottom w:type="dxa" w:w="50"/>
+              <w:right w:type="dxa" w:w="90"/>
+            </w:tcMar>
+          </w:tcPr>
+          <w:p>
+            <w:r>
+              <w:rPr>
+                <w:sz w:val="18"/>
+                <w:szCs w:val="18"/>
+              </w:rPr>
+              <w:t xml:space="preserve">416</w:t>
+            </w:r>
+          </w:p>
+        </w:tc>
+        <w:tc>
+          <w:tcPr>
+            <w:tcW w:type="dxa" w:w="2411"/>
+            <w:tcBorders>
+              <w:top w:val="single" w:color="D9D3F7" w:sz="4"/>
+              <w:left w:val="single" w:color="D9D3F7" w:sz="4"/>
+              <w:bottom w:val="single" w:color="D9D3F7" w:sz="4"/>
+              <w:right w:val="single" w:color="D9D3F7" w:sz="4"/>
+            </w:tcBorders>
+            <w:tcMar>
+              <w:top w:type="dxa" w:w="50"/>
+              <w:left w:type="dxa" w:w="90"/>
+              <w:bottom w:type="dxa" w:w="50"/>
+              <w:right w:type="dxa" w:w="90"/>
+            </w:tcMar>
+          </w:tcPr>
+          <w:p>
+            <w:r>
+              <w:rPr>
+                <w:sz w:val="18"/>
+                <w:szCs w:val="18"/>
+              </w:rPr>
+              <w:t xml:space="preserve">tous verts ; 3 fichiers (</w:t>
+            </w:r>
+            <w:r>
+              <w:rPr>
+                <w:rFonts w:ascii="Consolas" w:cs="Consolas" w:eastAsia="Consolas" w:hAnsi="Consolas"/>
+                <w:color w:val="3B2F8F"/>
+                <w:sz w:val="18"/>
+                <w:szCs w:val="18"/>
+              </w:rPr>
+              <w:t xml:space="preserve">conditionnement</w:t>
+            </w:r>
+            <w:r>
+              <w:rPr>
+                <w:sz w:val="18"/>
+                <w:szCs w:val="18"/>
+              </w:rPr>
+              <w:t xml:space="preserve">, </w:t>
+            </w:r>
+            <w:r>
+              <w:rPr>
+                <w:rFonts w:ascii="Consolas" w:cs="Consolas" w:eastAsia="Consolas" w:hAnsi="Consolas"/>
+                <w:color w:val="3B2F8F"/>
+                <w:sz w:val="18"/>
+                <w:szCs w:val="18"/>
+              </w:rPr>
+              <w:t xml:space="preserve">evenements-prives</w:t>
+            </w:r>
+            <w:r>
+              <w:rPr>
+                <w:sz w:val="18"/>
+                <w:szCs w:val="18"/>
+              </w:rPr>
+              <w:t xml:space="preserve">, </w:t>
+            </w:r>
+            <w:r>
+              <w:rPr>
+                <w:rFonts w:ascii="Consolas" w:cs="Consolas" w:eastAsia="Consolas" w:hAnsi="Consolas"/>
+                <w:color w:val="3B2F8F"/>
+                <w:sz w:val="18"/>
+                <w:szCs w:val="18"/>
+              </w:rPr>
+              <w:t xml:space="preserve">rapport-soiree</w:t>
+            </w:r>
+            <w:r>
+              <w:rPr>
+                <w:sz w:val="18"/>
+                <w:szCs w:val="18"/>
+              </w:rPr>
+              <w:t xml:space="preserve">) tombés pendant la suite sur des erreurs de l'environnement (fichier temporaire illisible, module npm introuvable, transformation interrompue — poste à court de mémoire), verts relancés seuls</w:t>
+            </w:r>
+          </w:p>
+        </w:tc>
+      </w:tr>
+      <w:tr>
+        <w:trPr>
+          <w:tblHeader w:val="false"/>
+        </w:trPr>
+        <w:tc>
+          <w:tcPr>
+            <w:tcW w:type="dxa" w:w="2409"/>
+            <w:tcBorders>
+              <w:top w:val="single" w:color="D9D3F7" w:sz="4"/>
+              <w:left w:val="single" w:color="D9D3F7" w:sz="4"/>
+              <w:bottom w:val="single" w:color="D9D3F7" w:sz="4"/>
+              <w:right w:val="single" w:color="D9D3F7" w:sz="4"/>
+            </w:tcBorders>
+            <w:tcMar>
+              <w:top w:type="dxa" w:w="50"/>
+              <w:left w:type="dxa" w:w="90"/>
+              <w:bottom w:type="dxa" w:w="50"/>
+              <w:right w:type="dxa" w:w="90"/>
+            </w:tcMar>
+          </w:tcPr>
+          <w:p>
+            <w:r>
+              <w:rPr>
+                <w:sz w:val="18"/>
+                <w:szCs w:val="18"/>
+              </w:rPr>
+              <w:t xml:space="preserve">Écrans (</w:t>
+            </w:r>
+            <w:r>
+              <w:rPr>
+                <w:rFonts w:ascii="Consolas" w:cs="Consolas" w:eastAsia="Consolas" w:hAnsi="Consolas"/>
+                <w:color w:val="3B2F8F"/>
+                <w:sz w:val="18"/>
+                <w:szCs w:val="18"/>
+              </w:rPr>
+              <w:t xml:space="preserve">apps/web</w:t>
+            </w:r>
+            <w:r>
+              <w:rPr>
+                <w:sz w:val="18"/>
+                <w:szCs w:val="18"/>
+              </w:rPr>
+              <w:t xml:space="preserve">)</w:t>
+            </w:r>
+          </w:p>
+        </w:tc>
+        <w:tc>
+          <w:tcPr>
+            <w:tcW w:type="dxa" w:w="2409"/>
+            <w:tcBorders>
+              <w:top w:val="single" w:color="D9D3F7" w:sz="4"/>
+              <w:left w:val="single" w:color="D9D3F7" w:sz="4"/>
+              <w:bottom w:val="single" w:color="D9D3F7" w:sz="4"/>
+              <w:right w:val="single" w:color="D9D3F7" w:sz="4"/>
+            </w:tcBorders>
+            <w:tcMar>
+              <w:top w:type="dxa" w:w="50"/>
+              <w:left w:type="dxa" w:w="90"/>
+              <w:bottom w:type="dxa" w:w="50"/>
+              <w:right w:type="dxa" w:w="90"/>
+            </w:tcMar>
+          </w:tcPr>
+          <w:p>
+            <w:r>
+              <w:rPr>
+                <w:sz w:val="18"/>
+                <w:szCs w:val="18"/>
+              </w:rPr>
+              <w:t xml:space="preserve">29</w:t>
+            </w:r>
+          </w:p>
+        </w:tc>
+        <w:tc>
+          <w:tcPr>
+            <w:tcW w:type="dxa" w:w="2409"/>
+            <w:tcBorders>
+              <w:top w:val="single" w:color="D9D3F7" w:sz="4"/>
+              <w:left w:val="single" w:color="D9D3F7" w:sz="4"/>
+              <w:bottom w:val="single" w:color="D9D3F7" w:sz="4"/>
+              <w:right w:val="single" w:color="D9D3F7" w:sz="4"/>
+            </w:tcBorders>
+            <w:tcMar>
+              <w:top w:type="dxa" w:w="50"/>
+              <w:left w:type="dxa" w:w="90"/>
+              <w:bottom w:type="dxa" w:w="50"/>
+              <w:right w:type="dxa" w:w="90"/>
+            </w:tcMar>
+          </w:tcPr>
+          <w:p>
+            <w:r>
+              <w:rPr>
+                <w:sz w:val="18"/>
+                <w:szCs w:val="18"/>
+              </w:rPr>
+              <w:t xml:space="preserve">106</w:t>
+            </w:r>
+          </w:p>
+        </w:tc>
+        <w:tc>
+          <w:tcPr>
+            <w:tcW w:type="dxa" w:w="2411"/>
+            <w:tcBorders>
+              <w:top w:val="single" w:color="D9D3F7" w:sz="4"/>
+              <w:left w:val="single" w:color="D9D3F7" w:sz="4"/>
+              <w:bottom w:val="single" w:color="D9D3F7" w:sz="4"/>
+              <w:right w:val="single" w:color="D9D3F7" w:sz="4"/>
+            </w:tcBorders>
+            <w:tcMar>
+              <w:top w:type="dxa" w:w="50"/>
+              <w:left w:type="dxa" w:w="90"/>
+              <w:bottom w:type="dxa" w:w="50"/>
+              <w:right w:type="dxa" w:w="90"/>
+            </w:tcMar>
+          </w:tcPr>
+          <w:p>
+            <w:r>
+              <w:rPr>
+                <w:sz w:val="18"/>
+                <w:szCs w:val="18"/>
+              </w:rPr>
+              <w:t xml:space="preserve">tous verts, dossier par dossier</w:t>
+            </w:r>
+          </w:p>
+        </w:tc>
+      </w:tr>
+    </w:tbl>
+    <w:p/>
     <w:p>
       <w:pPr>
         <w:pStyle w:val="Heading2"/>

</xml_diff>